<commit_message>
Generate and embed 12 UML diagrams into Task 5 Word report. Task 5 Complete!
</commit_message>
<xml_diff>
--- a/Portfolio WP2/5_Unjuk_Kerja Menggunakan Spesifikasi Program - Nugraha Jody.docx
+++ b/Portfolio WP2/5_Unjuk_Kerja Menggunakan Spesifikasi Program - Nugraha Jody.docx
@@ -138,17 +138,42 @@
     </w:tbl>
     <w:p>
       <w:pPr>
-        <w:spacing w:before="200" w:after="400"/>
+        <w:spacing w:before="200" w:after="300"/>
         <w:jc w:val="center"/>
       </w:pPr>
       <w:r>
-        <w:rPr>
-          <w:rFonts w:ascii="Arial" w:hAnsi="Arial"/>
-          <w:b/>
-          <w:color w:val="EF4444"/>
-          <w:sz w:val="22"/>
-        </w:rPr>
-        <w:t>[ TEMPEL GAMBAR: SEQUENCE DIAGRAM - LOGIN DI SINI ]</w:t>
+        <w:drawing>
+          <wp:inline xmlns:a="http://schemas.openxmlformats.org/drawingml/2006/main" xmlns:pic="http://schemas.openxmlformats.org/drawingml/2006/picture">
+            <wp:extent cx="4572000" cy="2286000"/>
+            <wp:docPr id="1" name="Picture 1"/>
+            <wp:cNvGraphicFramePr>
+              <a:graphicFrameLocks noChangeAspect="1"/>
+            </wp:cNvGraphicFramePr>
+            <a:graphic>
+              <a:graphicData uri="http://schemas.openxmlformats.org/drawingml/2006/picture">
+                <pic:pic>
+                  <pic:nvPicPr>
+                    <pic:cNvPr id="0" name="diagram_seq_login.png"/>
+                    <pic:cNvPicPr/>
+                  </pic:nvPicPr>
+                  <pic:blipFill>
+                    <a:blip r:embed="rId9"/>
+                    <a:stretch>
+                      <a:fillRect/>
+                    </a:stretch>
+                  </pic:blipFill>
+                  <pic:spPr>
+                    <a:xfrm>
+                      <a:off x="0" y="0"/>
+                      <a:ext cx="4572000" cy="2286000"/>
+                    </a:xfrm>
+                    <a:prstGeom prst="rect"/>
+                  </pic:spPr>
+                </pic:pic>
+              </a:graphicData>
+            </a:graphic>
+          </wp:inline>
+        </w:drawing>
       </w:r>
     </w:p>
     <w:p>
@@ -160,10 +185,10 @@
         <w:rPr>
           <w:rFonts w:ascii="Arial" w:hAnsi="Arial"/>
           <w:i/>
-          <w:color w:val="94A3B8"/>
+          <w:color w:val="64748B"/>
           <w:sz w:val="18"/>
         </w:rPr>
-        <w:t>(Silakan tempel diagram gambar/UML hasil rancangan Anda di atas)</w:t>
+        <w:t>(Spesifikasi Rancangan Sequence Diagram - Login)</w:t>
       </w:r>
     </w:p>
     <w:p>
@@ -239,17 +264,42 @@
     </w:tbl>
     <w:p>
       <w:pPr>
-        <w:spacing w:before="200" w:after="400"/>
+        <w:spacing w:before="200" w:after="300"/>
         <w:jc w:val="center"/>
       </w:pPr>
       <w:r>
-        <w:rPr>
-          <w:rFonts w:ascii="Arial" w:hAnsi="Arial"/>
-          <w:b/>
-          <w:color w:val="EF4444"/>
-          <w:sz w:val="22"/>
-        </w:rPr>
-        <w:t>[ TEMPEL GAMBAR: SEQUENCE DIAGRAM - DATA PAKET &amp; PRODUK (SPAREPART/JASA) DI SINI ]</w:t>
+        <w:drawing>
+          <wp:inline xmlns:a="http://schemas.openxmlformats.org/drawingml/2006/main" xmlns:pic="http://schemas.openxmlformats.org/drawingml/2006/picture">
+            <wp:extent cx="4572000" cy="2286000"/>
+            <wp:docPr id="2" name="Picture 2"/>
+            <wp:cNvGraphicFramePr>
+              <a:graphicFrameLocks noChangeAspect="1"/>
+            </wp:cNvGraphicFramePr>
+            <a:graphic>
+              <a:graphicData uri="http://schemas.openxmlformats.org/drawingml/2006/picture">
+                <pic:pic>
+                  <pic:nvPicPr>
+                    <pic:cNvPr id="0" name="diagram_seq_produk.png"/>
+                    <pic:cNvPicPr/>
+                  </pic:nvPicPr>
+                  <pic:blipFill>
+                    <a:blip r:embed="rId10"/>
+                    <a:stretch>
+                      <a:fillRect/>
+                    </a:stretch>
+                  </pic:blipFill>
+                  <pic:spPr>
+                    <a:xfrm>
+                      <a:off x="0" y="0"/>
+                      <a:ext cx="4572000" cy="2286000"/>
+                    </a:xfrm>
+                    <a:prstGeom prst="rect"/>
+                  </pic:spPr>
+                </pic:pic>
+              </a:graphicData>
+            </a:graphic>
+          </wp:inline>
+        </w:drawing>
       </w:r>
     </w:p>
     <w:p>
@@ -261,10 +311,10 @@
         <w:rPr>
           <w:rFonts w:ascii="Arial" w:hAnsi="Arial"/>
           <w:i/>
-          <w:color w:val="94A3B8"/>
+          <w:color w:val="64748B"/>
           <w:sz w:val="18"/>
         </w:rPr>
-        <w:t>(Silakan tempel diagram gambar/UML hasil rancangan Anda di atas)</w:t>
+        <w:t>(Spesifikasi Rancangan Sequence Diagram - Data Paket &amp; Produk (Sparepart/Jasa))</w:t>
       </w:r>
     </w:p>
     <w:p>
@@ -340,17 +390,42 @@
     </w:tbl>
     <w:p>
       <w:pPr>
-        <w:spacing w:before="200" w:after="400"/>
+        <w:spacing w:before="200" w:after="300"/>
         <w:jc w:val="center"/>
       </w:pPr>
       <w:r>
-        <w:rPr>
-          <w:rFonts w:ascii="Arial" w:hAnsi="Arial"/>
-          <w:b/>
-          <w:color w:val="EF4444"/>
-          <w:sz w:val="22"/>
-        </w:rPr>
-        <w:t>[ TEMPEL GAMBAR: SEQUENCE DIAGRAM - PENDAFTARAN CUSTOMER (REGISTRASI) DI SINI ]</w:t>
+        <w:drawing>
+          <wp:inline xmlns:a="http://schemas.openxmlformats.org/drawingml/2006/main" xmlns:pic="http://schemas.openxmlformats.org/drawingml/2006/picture">
+            <wp:extent cx="4572000" cy="2286000"/>
+            <wp:docPr id="3" name="Picture 3"/>
+            <wp:cNvGraphicFramePr>
+              <a:graphicFrameLocks noChangeAspect="1"/>
+            </wp:cNvGraphicFramePr>
+            <a:graphic>
+              <a:graphicData uri="http://schemas.openxmlformats.org/drawingml/2006/picture">
+                <pic:pic>
+                  <pic:nvPicPr>
+                    <pic:cNvPr id="0" name="diagram_seq_register.png"/>
+                    <pic:cNvPicPr/>
+                  </pic:nvPicPr>
+                  <pic:blipFill>
+                    <a:blip r:embed="rId11"/>
+                    <a:stretch>
+                      <a:fillRect/>
+                    </a:stretch>
+                  </pic:blipFill>
+                  <pic:spPr>
+                    <a:xfrm>
+                      <a:off x="0" y="0"/>
+                      <a:ext cx="4572000" cy="2286000"/>
+                    </a:xfrm>
+                    <a:prstGeom prst="rect"/>
+                  </pic:spPr>
+                </pic:pic>
+              </a:graphicData>
+            </a:graphic>
+          </wp:inline>
+        </w:drawing>
       </w:r>
     </w:p>
     <w:p>
@@ -362,10 +437,10 @@
         <w:rPr>
           <w:rFonts w:ascii="Arial" w:hAnsi="Arial"/>
           <w:i/>
-          <w:color w:val="94A3B8"/>
+          <w:color w:val="64748B"/>
           <w:sz w:val="18"/>
         </w:rPr>
-        <w:t>(Silakan tempel diagram gambar/UML hasil rancangan Anda di atas)</w:t>
+        <w:t>(Spesifikasi Rancangan Sequence Diagram - Pendaftaran Customer (Registrasi))</w:t>
       </w:r>
     </w:p>
     <w:p>
@@ -441,17 +516,42 @@
     </w:tbl>
     <w:p>
       <w:pPr>
-        <w:spacing w:before="200" w:after="400"/>
+        <w:spacing w:before="200" w:after="300"/>
         <w:jc w:val="center"/>
       </w:pPr>
       <w:r>
-        <w:rPr>
-          <w:rFonts w:ascii="Arial" w:hAnsi="Arial"/>
-          <w:b/>
-          <w:color w:val="EF4444"/>
-          <w:sz w:val="22"/>
-        </w:rPr>
-        <w:t>[ TEMPEL GAMBAR: SEQUENCE DIAGRAM - TRANSAKSI BOOKING &amp; PEMBAYARAN DI SINI ]</w:t>
+        <w:drawing>
+          <wp:inline xmlns:a="http://schemas.openxmlformats.org/drawingml/2006/main" xmlns:pic="http://schemas.openxmlformats.org/drawingml/2006/picture">
+            <wp:extent cx="4572000" cy="2286000"/>
+            <wp:docPr id="4" name="Picture 4"/>
+            <wp:cNvGraphicFramePr>
+              <a:graphicFrameLocks noChangeAspect="1"/>
+            </wp:cNvGraphicFramePr>
+            <a:graphic>
+              <a:graphicData uri="http://schemas.openxmlformats.org/drawingml/2006/picture">
+                <pic:pic>
+                  <pic:nvPicPr>
+                    <pic:cNvPr id="0" name="diagram_seq_transaksi.png"/>
+                    <pic:cNvPicPr/>
+                  </pic:nvPicPr>
+                  <pic:blipFill>
+                    <a:blip r:embed="rId12"/>
+                    <a:stretch>
+                      <a:fillRect/>
+                    </a:stretch>
+                  </pic:blipFill>
+                  <pic:spPr>
+                    <a:xfrm>
+                      <a:off x="0" y="0"/>
+                      <a:ext cx="4572000" cy="2286000"/>
+                    </a:xfrm>
+                    <a:prstGeom prst="rect"/>
+                  </pic:spPr>
+                </pic:pic>
+              </a:graphicData>
+            </a:graphic>
+          </wp:inline>
+        </w:drawing>
       </w:r>
     </w:p>
     <w:p>
@@ -463,10 +563,10 @@
         <w:rPr>
           <w:rFonts w:ascii="Arial" w:hAnsi="Arial"/>
           <w:i/>
-          <w:color w:val="94A3B8"/>
+          <w:color w:val="64748B"/>
           <w:sz w:val="18"/>
         </w:rPr>
-        <w:t>(Silakan tempel diagram gambar/UML hasil rancangan Anda di atas)</w:t>
+        <w:t>(Spesifikasi Rancangan Sequence Diagram - Transaksi Booking &amp; Pembayaran)</w:t>
       </w:r>
     </w:p>
     <w:p>
@@ -544,17 +644,42 @@
     </w:tbl>
     <w:p>
       <w:pPr>
-        <w:spacing w:before="200" w:after="400"/>
+        <w:spacing w:before="200" w:after="300"/>
         <w:jc w:val="center"/>
       </w:pPr>
       <w:r>
-        <w:rPr>
-          <w:rFonts w:ascii="Arial" w:hAnsi="Arial"/>
-          <w:b/>
-          <w:color w:val="EF4444"/>
-          <w:sz w:val="22"/>
-        </w:rPr>
-        <w:t>[ TEMPEL GAMBAR: RANCANGAN ENTITY RELATIONSHIP DIAGRAM (ERD) DI SINI ]</w:t>
+        <w:drawing>
+          <wp:inline xmlns:a="http://schemas.openxmlformats.org/drawingml/2006/main" xmlns:pic="http://schemas.openxmlformats.org/drawingml/2006/picture">
+            <wp:extent cx="4572000" cy="2286000"/>
+            <wp:docPr id="5" name="Picture 5"/>
+            <wp:cNvGraphicFramePr>
+              <a:graphicFrameLocks noChangeAspect="1"/>
+            </wp:cNvGraphicFramePr>
+            <a:graphic>
+              <a:graphicData uri="http://schemas.openxmlformats.org/drawingml/2006/picture">
+                <pic:pic>
+                  <pic:nvPicPr>
+                    <pic:cNvPr id="0" name="diagram_erd.png"/>
+                    <pic:cNvPicPr/>
+                  </pic:nvPicPr>
+                  <pic:blipFill>
+                    <a:blip r:embed="rId13"/>
+                    <a:stretch>
+                      <a:fillRect/>
+                    </a:stretch>
+                  </pic:blipFill>
+                  <pic:spPr>
+                    <a:xfrm>
+                      <a:off x="0" y="0"/>
+                      <a:ext cx="4572000" cy="2286000"/>
+                    </a:xfrm>
+                    <a:prstGeom prst="rect"/>
+                  </pic:spPr>
+                </pic:pic>
+              </a:graphicData>
+            </a:graphic>
+          </wp:inline>
+        </w:drawing>
       </w:r>
     </w:p>
     <w:p>
@@ -566,10 +691,10 @@
         <w:rPr>
           <w:rFonts w:ascii="Arial" w:hAnsi="Arial"/>
           <w:i/>
-          <w:color w:val="94A3B8"/>
+          <w:color w:val="64748B"/>
           <w:sz w:val="18"/>
         </w:rPr>
-        <w:t>(Silakan tempel diagram gambar/UML hasil rancangan Anda di atas)</w:t>
+        <w:t>(Spesifikasi Rancangan Rancangan Entity Relationship Diagram (ERD))</w:t>
       </w:r>
     </w:p>
     <w:p>
@@ -645,17 +770,42 @@
     </w:tbl>
     <w:p>
       <w:pPr>
-        <w:spacing w:before="200" w:after="400"/>
+        <w:spacing w:before="200" w:after="300"/>
         <w:jc w:val="center"/>
       </w:pPr>
       <w:r>
-        <w:rPr>
-          <w:rFonts w:ascii="Arial" w:hAnsi="Arial"/>
-          <w:b/>
-          <w:color w:val="EF4444"/>
-          <w:sz w:val="22"/>
-        </w:rPr>
-        <w:t>[ TEMPEL GAMBAR: RANCANGAN LOGICAL RECORD STRUCTURE (LRS) DI SINI ]</w:t>
+        <w:drawing>
+          <wp:inline xmlns:a="http://schemas.openxmlformats.org/drawingml/2006/main" xmlns:pic="http://schemas.openxmlformats.org/drawingml/2006/picture">
+            <wp:extent cx="4572000" cy="2286000"/>
+            <wp:docPr id="6" name="Picture 6"/>
+            <wp:cNvGraphicFramePr>
+              <a:graphicFrameLocks noChangeAspect="1"/>
+            </wp:cNvGraphicFramePr>
+            <a:graphic>
+              <a:graphicData uri="http://schemas.openxmlformats.org/drawingml/2006/picture">
+                <pic:pic>
+                  <pic:nvPicPr>
+                    <pic:cNvPr id="0" name="diagram_lrs.png"/>
+                    <pic:cNvPicPr/>
+                  </pic:nvPicPr>
+                  <pic:blipFill>
+                    <a:blip r:embed="rId14"/>
+                    <a:stretch>
+                      <a:fillRect/>
+                    </a:stretch>
+                  </pic:blipFill>
+                  <pic:spPr>
+                    <a:xfrm>
+                      <a:off x="0" y="0"/>
+                      <a:ext cx="4572000" cy="2286000"/>
+                    </a:xfrm>
+                    <a:prstGeom prst="rect"/>
+                  </pic:spPr>
+                </pic:pic>
+              </a:graphicData>
+            </a:graphic>
+          </wp:inline>
+        </w:drawing>
       </w:r>
     </w:p>
     <w:p>
@@ -667,10 +817,10 @@
         <w:rPr>
           <w:rFonts w:ascii="Arial" w:hAnsi="Arial"/>
           <w:i/>
-          <w:color w:val="94A3B8"/>
+          <w:color w:val="64748B"/>
           <w:sz w:val="18"/>
         </w:rPr>
-        <w:t>(Silakan tempel diagram gambar/UML hasil rancangan Anda di atas)</w:t>
+        <w:t>(Spesifikasi Rancangan Rancangan Logical Record Structure (LRS))</w:t>
       </w:r>
     </w:p>
     <w:p>
@@ -748,17 +898,42 @@
     </w:tbl>
     <w:p>
       <w:pPr>
-        <w:spacing w:before="200" w:after="400"/>
+        <w:spacing w:before="200" w:after="300"/>
         <w:jc w:val="center"/>
       </w:pPr>
       <w:r>
-        <w:rPr>
-          <w:rFonts w:ascii="Arial" w:hAnsi="Arial"/>
-          <w:b/>
-          <w:color w:val="EF4444"/>
-          <w:sz w:val="22"/>
-        </w:rPr>
-        <w:t>[ TEMPEL GAMBAR: USE CASE DIAGRAM - AKTOR ADMIN, MEKANIK &amp; CUSTOMER DI SINI ]</w:t>
+        <w:drawing>
+          <wp:inline xmlns:a="http://schemas.openxmlformats.org/drawingml/2006/main" xmlns:pic="http://schemas.openxmlformats.org/drawingml/2006/picture">
+            <wp:extent cx="4572000" cy="2438400"/>
+            <wp:docPr id="7" name="Picture 7"/>
+            <wp:cNvGraphicFramePr>
+              <a:graphicFrameLocks noChangeAspect="1"/>
+            </wp:cNvGraphicFramePr>
+            <a:graphic>
+              <a:graphicData uri="http://schemas.openxmlformats.org/drawingml/2006/picture">
+                <pic:pic>
+                  <pic:nvPicPr>
+                    <pic:cNvPr id="0" name="diagram_usecase.png"/>
+                    <pic:cNvPicPr/>
+                  </pic:nvPicPr>
+                  <pic:blipFill>
+                    <a:blip r:embed="rId15"/>
+                    <a:stretch>
+                      <a:fillRect/>
+                    </a:stretch>
+                  </pic:blipFill>
+                  <pic:spPr>
+                    <a:xfrm>
+                      <a:off x="0" y="0"/>
+                      <a:ext cx="4572000" cy="2438400"/>
+                    </a:xfrm>
+                    <a:prstGeom prst="rect"/>
+                  </pic:spPr>
+                </pic:pic>
+              </a:graphicData>
+            </a:graphic>
+          </wp:inline>
+        </w:drawing>
       </w:r>
     </w:p>
     <w:p>
@@ -770,10 +945,10 @@
         <w:rPr>
           <w:rFonts w:ascii="Arial" w:hAnsi="Arial"/>
           <w:i/>
-          <w:color w:val="94A3B8"/>
+          <w:color w:val="64748B"/>
           <w:sz w:val="18"/>
         </w:rPr>
-        <w:t>(Silakan tempel diagram gambar/UML hasil rancangan Anda di atas)</w:t>
+        <w:t>(Spesifikasi Rancangan Use Case Diagram - Aktor Admin, Mekanik &amp; Customer)</w:t>
       </w:r>
     </w:p>
     <w:p>
@@ -845,17 +1020,42 @@
     </w:tbl>
     <w:p>
       <w:pPr>
-        <w:spacing w:before="200" w:after="400"/>
+        <w:spacing w:before="200" w:after="300"/>
         <w:jc w:val="center"/>
       </w:pPr>
       <w:r>
-        <w:rPr>
-          <w:rFonts w:ascii="Arial" w:hAnsi="Arial"/>
-          <w:b/>
-          <w:color w:val="EF4444"/>
-          <w:sz w:val="22"/>
-        </w:rPr>
-        <w:t>[ TEMPEL GAMBAR: ACTIVITY DIAGRAM - ALUR LOGIN USER DI SINI ]</w:t>
+        <w:drawing>
+          <wp:inline xmlns:a="http://schemas.openxmlformats.org/drawingml/2006/main" xmlns:pic="http://schemas.openxmlformats.org/drawingml/2006/picture">
+            <wp:extent cx="4572000" cy="2286000"/>
+            <wp:docPr id="8" name="Picture 8"/>
+            <wp:cNvGraphicFramePr>
+              <a:graphicFrameLocks noChangeAspect="1"/>
+            </wp:cNvGraphicFramePr>
+            <a:graphic>
+              <a:graphicData uri="http://schemas.openxmlformats.org/drawingml/2006/picture">
+                <pic:pic>
+                  <pic:nvPicPr>
+                    <pic:cNvPr id="0" name="diagram_act_login.png"/>
+                    <pic:cNvPicPr/>
+                  </pic:nvPicPr>
+                  <pic:blipFill>
+                    <a:blip r:embed="rId16"/>
+                    <a:stretch>
+                      <a:fillRect/>
+                    </a:stretch>
+                  </pic:blipFill>
+                  <pic:spPr>
+                    <a:xfrm>
+                      <a:off x="0" y="0"/>
+                      <a:ext cx="4572000" cy="2286000"/>
+                    </a:xfrm>
+                    <a:prstGeom prst="rect"/>
+                  </pic:spPr>
+                </pic:pic>
+              </a:graphicData>
+            </a:graphic>
+          </wp:inline>
+        </w:drawing>
       </w:r>
     </w:p>
     <w:p>
@@ -867,10 +1067,10 @@
         <w:rPr>
           <w:rFonts w:ascii="Arial" w:hAnsi="Arial"/>
           <w:i/>
-          <w:color w:val="94A3B8"/>
+          <w:color w:val="64748B"/>
           <w:sz w:val="18"/>
         </w:rPr>
-        <w:t>(Silakan tempel diagram gambar/UML hasil rancangan Anda di atas)</w:t>
+        <w:t>(Spesifikasi Rancangan Activity Diagram - Alur Login User)</w:t>
       </w:r>
     </w:p>
     <w:p>
@@ -942,17 +1142,42 @@
     </w:tbl>
     <w:p>
       <w:pPr>
-        <w:spacing w:before="200" w:after="400"/>
+        <w:spacing w:before="200" w:after="300"/>
         <w:jc w:val="center"/>
       </w:pPr>
       <w:r>
-        <w:rPr>
-          <w:rFonts w:ascii="Arial" w:hAnsi="Arial"/>
-          <w:b/>
-          <w:color w:val="EF4444"/>
-          <w:sz w:val="22"/>
-        </w:rPr>
-        <w:t>[ TEMPEL GAMBAR: ACTIVITY DIAGRAM - ADMIN MENGELOLA MEKANIK DI SINI ]</w:t>
+        <w:drawing>
+          <wp:inline xmlns:a="http://schemas.openxmlformats.org/drawingml/2006/main" xmlns:pic="http://schemas.openxmlformats.org/drawingml/2006/picture">
+            <wp:extent cx="4572000" cy="2286000"/>
+            <wp:docPr id="9" name="Picture 9"/>
+            <wp:cNvGraphicFramePr>
+              <a:graphicFrameLocks noChangeAspect="1"/>
+            </wp:cNvGraphicFramePr>
+            <a:graphic>
+              <a:graphicData uri="http://schemas.openxmlformats.org/drawingml/2006/picture">
+                <pic:pic>
+                  <pic:nvPicPr>
+                    <pic:cNvPr id="0" name="diagram_act_mekanik.png"/>
+                    <pic:cNvPicPr/>
+                  </pic:nvPicPr>
+                  <pic:blipFill>
+                    <a:blip r:embed="rId17"/>
+                    <a:stretch>
+                      <a:fillRect/>
+                    </a:stretch>
+                  </pic:blipFill>
+                  <pic:spPr>
+                    <a:xfrm>
+                      <a:off x="0" y="0"/>
+                      <a:ext cx="4572000" cy="2286000"/>
+                    </a:xfrm>
+                    <a:prstGeom prst="rect"/>
+                  </pic:spPr>
+                </pic:pic>
+              </a:graphicData>
+            </a:graphic>
+          </wp:inline>
+        </w:drawing>
       </w:r>
     </w:p>
     <w:p>
@@ -964,10 +1189,10 @@
         <w:rPr>
           <w:rFonts w:ascii="Arial" w:hAnsi="Arial"/>
           <w:i/>
-          <w:color w:val="94A3B8"/>
+          <w:color w:val="64748B"/>
           <w:sz w:val="18"/>
         </w:rPr>
-        <w:t>(Silakan tempel diagram gambar/UML hasil rancangan Anda di atas)</w:t>
+        <w:t>(Spesifikasi Rancangan Activity Diagram - Admin Mengelola Mekanik)</w:t>
       </w:r>
     </w:p>
     <w:p>
@@ -1039,17 +1264,42 @@
     </w:tbl>
     <w:p>
       <w:pPr>
-        <w:spacing w:before="200" w:after="400"/>
+        <w:spacing w:before="200" w:after="300"/>
         <w:jc w:val="center"/>
       </w:pPr>
       <w:r>
-        <w:rPr>
-          <w:rFonts w:ascii="Arial" w:hAnsi="Arial"/>
-          <w:b/>
-          <w:color w:val="EF4444"/>
-          <w:sz w:val="22"/>
-        </w:rPr>
-        <w:t>[ TEMPEL GAMBAR: ACTIVITY DIAGRAM - ADMIN MENGELOLA CUSTOMER DI SINI ]</w:t>
+        <w:drawing>
+          <wp:inline xmlns:a="http://schemas.openxmlformats.org/drawingml/2006/main" xmlns:pic="http://schemas.openxmlformats.org/drawingml/2006/picture">
+            <wp:extent cx="4572000" cy="2286000"/>
+            <wp:docPr id="10" name="Picture 10"/>
+            <wp:cNvGraphicFramePr>
+              <a:graphicFrameLocks noChangeAspect="1"/>
+            </wp:cNvGraphicFramePr>
+            <a:graphic>
+              <a:graphicData uri="http://schemas.openxmlformats.org/drawingml/2006/picture">
+                <pic:pic>
+                  <pic:nvPicPr>
+                    <pic:cNvPr id="0" name="diagram_act_customer.png"/>
+                    <pic:cNvPicPr/>
+                  </pic:nvPicPr>
+                  <pic:blipFill>
+                    <a:blip r:embed="rId18"/>
+                    <a:stretch>
+                      <a:fillRect/>
+                    </a:stretch>
+                  </pic:blipFill>
+                  <pic:spPr>
+                    <a:xfrm>
+                      <a:off x="0" y="0"/>
+                      <a:ext cx="4572000" cy="2286000"/>
+                    </a:xfrm>
+                    <a:prstGeom prst="rect"/>
+                  </pic:spPr>
+                </pic:pic>
+              </a:graphicData>
+            </a:graphic>
+          </wp:inline>
+        </w:drawing>
       </w:r>
     </w:p>
     <w:p>
@@ -1061,10 +1311,10 @@
         <w:rPr>
           <w:rFonts w:ascii="Arial" w:hAnsi="Arial"/>
           <w:i/>
-          <w:color w:val="94A3B8"/>
+          <w:color w:val="64748B"/>
           <w:sz w:val="18"/>
         </w:rPr>
-        <w:t>(Silakan tempel diagram gambar/UML hasil rancangan Anda di atas)</w:t>
+        <w:t>(Spesifikasi Rancangan Activity Diagram - Admin Mengelola Customer)</w:t>
       </w:r>
     </w:p>
     <w:p>
@@ -1136,17 +1386,42 @@
     </w:tbl>
     <w:p>
       <w:pPr>
-        <w:spacing w:before="200" w:after="400"/>
+        <w:spacing w:before="200" w:after="300"/>
         <w:jc w:val="center"/>
       </w:pPr>
       <w:r>
-        <w:rPr>
-          <w:rFonts w:ascii="Arial" w:hAnsi="Arial"/>
-          <w:b/>
-          <w:color w:val="EF4444"/>
-          <w:sz w:val="22"/>
-        </w:rPr>
-        <w:t>[ TEMPEL GAMBAR: ACTIVITY DIAGRAM - ADMIN MENGELOLA DATA TRANSAKSI DI SINI ]</w:t>
+        <w:drawing>
+          <wp:inline xmlns:a="http://schemas.openxmlformats.org/drawingml/2006/main" xmlns:pic="http://schemas.openxmlformats.org/drawingml/2006/picture">
+            <wp:extent cx="4572000" cy="2286000"/>
+            <wp:docPr id="11" name="Picture 11"/>
+            <wp:cNvGraphicFramePr>
+              <a:graphicFrameLocks noChangeAspect="1"/>
+            </wp:cNvGraphicFramePr>
+            <a:graphic>
+              <a:graphicData uri="http://schemas.openxmlformats.org/drawingml/2006/picture">
+                <pic:pic>
+                  <pic:nvPicPr>
+                    <pic:cNvPr id="0" name="diagram_act_transaksi.png"/>
+                    <pic:cNvPicPr/>
+                  </pic:nvPicPr>
+                  <pic:blipFill>
+                    <a:blip r:embed="rId19"/>
+                    <a:stretch>
+                      <a:fillRect/>
+                    </a:stretch>
+                  </pic:blipFill>
+                  <pic:spPr>
+                    <a:xfrm>
+                      <a:off x="0" y="0"/>
+                      <a:ext cx="4572000" cy="2286000"/>
+                    </a:xfrm>
+                    <a:prstGeom prst="rect"/>
+                  </pic:spPr>
+                </pic:pic>
+              </a:graphicData>
+            </a:graphic>
+          </wp:inline>
+        </w:drawing>
       </w:r>
     </w:p>
     <w:p>
@@ -1158,10 +1433,10 @@
         <w:rPr>
           <w:rFonts w:ascii="Arial" w:hAnsi="Arial"/>
           <w:i/>
-          <w:color w:val="94A3B8"/>
+          <w:color w:val="64748B"/>
           <w:sz w:val="18"/>
         </w:rPr>
-        <w:t>(Silakan tempel diagram gambar/UML hasil rancangan Anda di atas)</w:t>
+        <w:t>(Spesifikasi Rancangan Activity Diagram - Admin Mengelola Data Transaksi)</w:t>
       </w:r>
     </w:p>
     <w:p>
@@ -1233,17 +1508,42 @@
     </w:tbl>
     <w:p>
       <w:pPr>
-        <w:spacing w:before="200" w:after="400"/>
+        <w:spacing w:before="200" w:after="300"/>
         <w:jc w:val="center"/>
       </w:pPr>
       <w:r>
-        <w:rPr>
-          <w:rFonts w:ascii="Arial" w:hAnsi="Arial"/>
-          <w:b/>
-          <w:color w:val="EF4444"/>
-          <w:sz w:val="22"/>
-        </w:rPr>
-        <w:t>[ TEMPEL GAMBAR: ACTIVITY DIAGRAM - ADMIN MENGELOLA DATA PRODUK / SPAREPART DI SINI ]</w:t>
+        <w:drawing>
+          <wp:inline xmlns:a="http://schemas.openxmlformats.org/drawingml/2006/main" xmlns:pic="http://schemas.openxmlformats.org/drawingml/2006/picture">
+            <wp:extent cx="4572000" cy="2286000"/>
+            <wp:docPr id="12" name="Picture 12"/>
+            <wp:cNvGraphicFramePr>
+              <a:graphicFrameLocks noChangeAspect="1"/>
+            </wp:cNvGraphicFramePr>
+            <a:graphic>
+              <a:graphicData uri="http://schemas.openxmlformats.org/drawingml/2006/picture">
+                <pic:pic>
+                  <pic:nvPicPr>
+                    <pic:cNvPr id="0" name="diagram_act_produk.png"/>
+                    <pic:cNvPicPr/>
+                  </pic:nvPicPr>
+                  <pic:blipFill>
+                    <a:blip r:embed="rId20"/>
+                    <a:stretch>
+                      <a:fillRect/>
+                    </a:stretch>
+                  </pic:blipFill>
+                  <pic:spPr>
+                    <a:xfrm>
+                      <a:off x="0" y="0"/>
+                      <a:ext cx="4572000" cy="2286000"/>
+                    </a:xfrm>
+                    <a:prstGeom prst="rect"/>
+                  </pic:spPr>
+                </pic:pic>
+              </a:graphicData>
+            </a:graphic>
+          </wp:inline>
+        </w:drawing>
       </w:r>
     </w:p>
     <w:p>
@@ -1255,10 +1555,10 @@
         <w:rPr>
           <w:rFonts w:ascii="Arial" w:hAnsi="Arial"/>
           <w:i/>
-          <w:color w:val="94A3B8"/>
+          <w:color w:val="64748B"/>
           <w:sz w:val="18"/>
         </w:rPr>
-        <w:t>(Silakan tempel diagram gambar/UML hasil rancangan Anda di atas)</w:t>
+        <w:t>(Spesifikasi Rancangan Activity Diagram - Admin Mengelola Data Produk / Sparepart)</w:t>
       </w:r>
     </w:p>
     <w:sectPr>

</xml_diff>